<commit_message>
organização e tweaks v1
</commit_message>
<xml_diff>
--- a/uso_de_ia_AM1.docx
+++ b/uso_de_ia_AM1.docx
@@ -24,7 +24,7 @@
         <w:rPr>
           <w:b/>
         </w:rPr>
-        <w:t>Data de início:</w:t>
+        <w:t>Data:</w:t>
       </w:r>
       <w:r>
         <w:t xml:space="preserve"> 2026-09-14</w:t>
@@ -43,7 +43,7 @@
         <w:pStyle w:val="Heading3"/>
       </w:pPr>
       <w:r>
-        <w:t>Sessão 1 — 2026-09-14 (chat): replicação do pipeline para a Jamaica</w:t>
+        <w:t>Sessão 1 — chat: replicação do pipeline para a Jamaica</w:t>
       </w:r>
     </w:p>
     <w:p>
@@ -51,7 +51,7 @@
         <w:pStyle w:val="ListBullet"/>
       </w:pPr>
       <w:r>
-        <w:t>Prompt: enunciados da AM1 e do projeto final; pedido de pipeline de extração para Jamaica / solar e armazenamento.</w:t>
+        <w:t>Prompt: enunciados da AM1 e do projeto final; pedido de pipeline de extração para Jamaica / solar e armazenamento, replicado do projeto anterior (Japão / tecnologia).</w:t>
       </w:r>
     </w:p>
     <w:p>
@@ -68,7 +68,70 @@
         <w:t>jamaica_AM1/</w:t>
       </w:r>
       <w:r>
-        <w:t xml:space="preserve"> com catálogo generalizado (país, comparadores e nomes no YAML), extratores worldbank/undp/csv_url/manual, run_all.py, transform.py e prompt para o Claude Code.</w:t>
+        <w:t xml:space="preserve"> com catálogo generalizado (país, comparadores, nomes e referência de convergência em </w:t>
+      </w:r>
+      <w:r>
+        <w:rPr>
+          <w:rFonts w:ascii="Consolas" w:hAnsi="Consolas" w:eastAsia="Consolas"/>
+        </w:rPr>
+        <w:t>config/series.yaml</w:t>
+      </w:r>
+      <w:r>
+        <w:t xml:space="preserve">), extratores </w:t>
+      </w:r>
+      <w:r>
+        <w:rPr>
+          <w:rFonts w:ascii="Consolas" w:hAnsi="Consolas" w:eastAsia="Consolas"/>
+        </w:rPr>
+        <w:t>worldbank</w:t>
+      </w:r>
+      <w:r>
+        <w:t xml:space="preserve">, </w:t>
+      </w:r>
+      <w:r>
+        <w:rPr>
+          <w:rFonts w:ascii="Consolas" w:hAnsi="Consolas" w:eastAsia="Consolas"/>
+        </w:rPr>
+        <w:t>undp</w:t>
+      </w:r>
+      <w:r>
+        <w:t xml:space="preserve">, </w:t>
+      </w:r>
+      <w:r>
+        <w:rPr>
+          <w:rFonts w:ascii="Consolas" w:hAnsi="Consolas" w:eastAsia="Consolas"/>
+        </w:rPr>
+        <w:t>csv_url</w:t>
+      </w:r>
+      <w:r>
+        <w:t xml:space="preserve"> e </w:t>
+      </w:r>
+      <w:r>
+        <w:rPr>
+          <w:rFonts w:ascii="Consolas" w:hAnsi="Consolas" w:eastAsia="Consolas"/>
+        </w:rPr>
+        <w:t>manual</w:t>
+      </w:r>
+      <w:r>
+        <w:t xml:space="preserve">, </w:t>
+      </w:r>
+      <w:r>
+        <w:rPr>
+          <w:rFonts w:ascii="Consolas" w:hAnsi="Consolas" w:eastAsia="Consolas"/>
+        </w:rPr>
+        <w:t>run_all.py</w:t>
+      </w:r>
+      <w:r>
+        <w:t xml:space="preserve">, </w:t>
+      </w:r>
+      <w:r>
+        <w:rPr>
+          <w:rFonts w:ascii="Consolas" w:hAnsi="Consolas" w:eastAsia="Consolas"/>
+        </w:rPr>
+        <w:t>transform.py</w:t>
+      </w:r>
+      <w:r>
+        <w:t xml:space="preserve"> e o prompt para o Claude Code.</w:t>
       </w:r>
     </w:p>
     <w:p>
@@ -79,7 +142,7 @@
         <w:rPr>
           <w:i/>
         </w:rPr>
-        <w:t>Colar aqui os prompts e respostas completos da sessão de chat, em ordem cronológica. As interações do Claude Code estão transcritas no Anexo, ao final deste arquivo.</w:t>
+        <w:t>Colar aqui os prompts e respostas completos da sessão de chat, em ordem cronológica. As interações do Claude Code estão transcritas no Anexo.</w:t>
       </w:r>
     </w:p>
     <w:p>
@@ -87,7 +150,7 @@
         <w:pStyle w:val="Heading3"/>
       </w:pPr>
       <w:r>
-        <w:t>Sessão 2 — 2026-09-14 (Claude Code): completar, executar e verificar o pipeline</w:t>
+        <w:t>Sessão 2 — Claude Code: completar, executar e verificar o pipeline</w:t>
       </w:r>
     </w:p>
     <w:p>
@@ -107,38 +170,7 @@
         <w:t>prompt_claude_code_AM1_jamaica.md</w:t>
       </w:r>
       <w:r>
-        <w:t xml:space="preserve"> (sete tarefas: ambiente, catálogo, tabelas manuais, extração, verificação, figuras e derivados, relatório final; transcrito no Anexo A). O agente não redesenhou o pipeline: completou o catálogo consultando as fontes reais, preencheu as tabelas manuais com documentos públicos, rodou e verificou tudo.</w:t>
-      </w:r>
-    </w:p>
-    <w:p>
-      <w:pPr>
-        <w:pStyle w:val="Heading4"/>
-      </w:pPr>
-      <w:r>
-        <w:t>O que rodou</w:t>
-      </w:r>
-    </w:p>
-    <w:p>
-      <w:pPr>
-        <w:pStyle w:val="ListNumber"/>
-      </w:pPr>
-      <w:r>
-        <w:rPr>
-          <w:b/>
-        </w:rPr>
-        <w:t>Ambiente.</w:t>
-      </w:r>
-      <w:r>
-        <w:t xml:space="preserve"> Pasta já descompactada (idêntica ao </w:t>
-      </w:r>
-      <w:r>
-        <w:rPr>
-          <w:rFonts w:ascii="Consolas" w:hAnsi="Consolas" w:eastAsia="Consolas"/>
-        </w:rPr>
-        <w:t>jamaica_AM1.zip</w:t>
-      </w:r>
-      <w:r>
-        <w:t xml:space="preserve">); venv com Python 3.14.3, pandas 3.0.5, requests 2.34.2, PyYAML 6.0.3, matplotlib 3.11.2 (só </w:t>
+        <w:t xml:space="preserve"> (Anexo A). O agente não redesenhou o pipeline: completou o catálogo consultando as fontes reais, preencheu as tabelas manuais com documentos públicos, rodou e verificou tudo. Ambiente: Python 3.14.3, pandas 3.0.5, requests 2.34.2, PyYAML 6.0.3, matplotlib 3.11.2; nenhum pacote além de </w:t>
       </w:r>
       <w:r>
         <w:rPr>
@@ -147,21 +179,29 @@
         <w:t>requirements.txt</w:t>
       </w:r>
       <w:r>
-        <w:t>; nenhum pacote extra no projeto).</w:t>
+        <w:t>.</w:t>
       </w:r>
     </w:p>
     <w:p>
       <w:pPr>
-        <w:pStyle w:val="ListNumber"/>
+        <w:pStyle w:val="Heading4"/>
+      </w:pPr>
+      <w:r>
+        <w:t>Consulta às fontes (não de memória)</w:t>
+      </w:r>
+    </w:p>
+    <w:p>
+      <w:pPr>
+        <w:pStyle w:val="ListBullet"/>
       </w:pPr>
       <w:r>
         <w:rPr>
           <w:b/>
         </w:rPr>
-        <w:t>Consulta às fontes (não de memória).</w:t>
+        <w:t>Banco Mundial:</w:t>
       </w:r>
       <w:r>
-        <w:t xml:space="preserve"> Metadados dos indicadores na API do Banco Mundial (</w:t>
+        <w:t xml:space="preserve"> metadados de cada indicador na API (</w:t>
       </w:r>
       <w:r>
         <w:rPr>
@@ -170,7 +210,7 @@
         <w:t>/v2/indicator/&lt;codigo&gt;?format=json&amp;source=...</w:t>
       </w:r>
       <w:r>
-        <w:t xml:space="preserve">): todos os códigos confirmados, inclusive </w:t>
+        <w:t xml:space="preserve">). Todos os códigos confirmados; </w:t>
       </w:r>
       <w:r>
         <w:rPr>
@@ -179,7 +219,7 @@
         <w:t>HD.HCI.OVRL</w:t>
       </w:r>
       <w:r>
-        <w:t xml:space="preserve"> na fonte 63 e </w:t>
+        <w:t xml:space="preserve"> vive na fonte 63 e o Rule of Law é </w:t>
       </w:r>
       <w:r>
         <w:rPr>
@@ -197,7 +237,21 @@
         <w:t>RL.EST</w:t>
       </w:r>
       <w:r>
-        <w:t xml:space="preserve"> não existe mais nessa fonte). Página de downloads do HDR: o arquivo continua </w:t>
+        <w:t xml:space="preserve"> não existe mais nessa fonte).</w:t>
+      </w:r>
+    </w:p>
+    <w:p>
+      <w:pPr>
+        <w:pStyle w:val="ListBullet"/>
+      </w:pPr>
+      <w:r>
+        <w:rPr>
+          <w:b/>
+        </w:rPr>
+        <w:t>HDR:</w:t>
+      </w:r>
+      <w:r>
+        <w:t xml:space="preserve"> a página de downloads continua apontando para </w:t>
       </w:r>
       <w:r>
         <w:rPr>
@@ -206,16 +260,76 @@
         <w:t>HDR25_Composite_indices_complete_time_series.csv</w:t>
       </w:r>
       <w:r>
-        <w:t xml:space="preserve"> (2 MB, maio de 2025). Página e arquivos do Ember: o formato mudou em julho de 2026 (ver alterações). Metadados do grapher do OWID e API PxWeb do IRENASTAT (tabela </w:t>
+        <w:t xml:space="preserve"> (séries 1990–2023).</w:t>
+      </w:r>
+    </w:p>
+    <w:p>
+      <w:pPr>
+        <w:pStyle w:val="ListBullet"/>
+      </w:pPr>
+      <w:r>
+        <w:rPr>
+          <w:b/>
+        </w:rPr>
+        <w:t>Ember:</w:t>
+      </w:r>
+      <w:r>
+        <w:t xml:space="preserve"> em julho de 2026 o formato mudou. O arquivo anual atual é </w:t>
       </w:r>
       <w:r>
         <w:rPr>
           <w:rFonts w:ascii="Consolas" w:hAnsi="Consolas" w:eastAsia="Consolas"/>
         </w:rPr>
-        <w:t>Country_ELECCAP_2026_H1</w:t>
+        <w:t>release_generation_yearly_global.csv</w:t>
       </w:r>
       <w:r>
-        <w:t>): usados para conferir a série de capacidade solar. API SDMX 2.1 do FMI (</w:t>
+        <w:t>, com uma linha por área, ano e fonte de eletricidade e as métricas em colunas; as colunas Category/Subcategory/Variable/Unit/Value do formato longo antigo não existem mais. O arquivo "Europe only" não tem os países do grupo.</w:t>
+      </w:r>
+    </w:p>
+    <w:p>
+      <w:pPr>
+        <w:pStyle w:val="ListBullet"/>
+      </w:pPr>
+      <w:r>
+        <w:rPr>
+          <w:b/>
+        </w:rPr>
+        <w:t>IRENA:</w:t>
+      </w:r>
+      <w:r>
+        <w:t xml:space="preserve"> não oferece URL de download direto em CSV. O IRENASTAT (PxWeb) só devolve CSV por requisição POST e o irena.org bloqueia acesso automatizado (HTTP 403). Seguindo a regra do prompt, usou-se a republicação do Our World in Data (</w:t>
+      </w:r>
+      <w:r>
+        <w:rPr>
+          <w:rFonts w:ascii="Consolas" w:hAnsi="Consolas" w:eastAsia="Consolas"/>
+        </w:rPr>
+        <w:t>installed-solar-pv-capacity.csv</w:t>
+      </w:r>
+      <w:r>
+        <w:t>), conferida contra a API do IRENASTAT: valores iguais à soma PV on-grid + off-grid em todos os anos (diferença máxima 0,01 MW; única exceção Costa Rica 2012, 0,9 MW) e solar térmica de concentração nula nos sete países, logo "solar total" = fotovoltaica.</w:t>
+      </w:r>
+    </w:p>
+    <w:p>
+      <w:pPr>
+        <w:pStyle w:val="ListBullet"/>
+      </w:pPr>
+      <w:r>
+        <w:rPr>
+          <w:b/>
+        </w:rPr>
+        <w:t>FMI:</w:t>
+      </w:r>
+      <w:r>
+        <w:t xml:space="preserve"> a série </w:t>
+      </w:r>
+      <w:r>
+        <w:rPr>
+          <w:rFonts w:ascii="Consolas" w:hAnsi="Consolas" w:eastAsia="Consolas"/>
+        </w:rPr>
+        <w:t>GGXWDG_NGDP</w:t>
+      </w:r>
+      <w:r>
+        <w:t xml:space="preserve"> do WEO (dívida bruta do governo geral) foi testada na API SDMX 2.1 (</w:t>
       </w:r>
       <w:r>
         <w:rPr>
@@ -224,302 +338,7 @@
         <w:t>api.imf.org</w:t>
       </w:r>
       <w:r>
-        <w:t>): testada para a alternativa de dívida.</w:t>
-      </w:r>
-    </w:p>
-    <w:p>
-      <w:pPr>
-        <w:pStyle w:val="ListNumber"/>
-      </w:pPr>
-      <w:r>
-        <w:rPr>
-          <w:b/>
-        </w:rPr>
-        <w:t>Extração</w:t>
-      </w:r>
-      <w:r>
-        <w:t xml:space="preserve"> (</w:t>
-      </w:r>
-      <w:r>
-        <w:rPr>
-          <w:rFonts w:ascii="Consolas" w:hAnsi="Consolas" w:eastAsia="Consolas"/>
-        </w:rPr>
-        <w:t>run_all.py</w:t>
-      </w:r>
-      <w:r>
-        <w:t xml:space="preserve">): 13 de 13 séries com status </w:t>
-      </w:r>
-      <w:r>
-        <w:rPr>
-          <w:rFonts w:ascii="Consolas" w:hAnsi="Consolas" w:eastAsia="Consolas"/>
-        </w:rPr>
-        <w:t>ok</w:t>
-      </w:r>
-      <w:r>
-        <w:t xml:space="preserve"> em </w:t>
-      </w:r>
-      <w:r>
-        <w:rPr>
-          <w:rFonts w:ascii="Consolas" w:hAnsi="Consolas" w:eastAsia="Consolas"/>
-        </w:rPr>
-        <w:t>log_extracao.csv</w:t>
-      </w:r>
-      <w:r>
-        <w:t xml:space="preserve">; brutos datados em </w:t>
-      </w:r>
-      <w:r>
-        <w:rPr>
-          <w:rFonts w:ascii="Consolas" w:hAnsi="Consolas" w:eastAsia="Consolas"/>
-        </w:rPr>
-        <w:t>dados/brutos/</w:t>
-      </w:r>
-      <w:r>
-        <w:t xml:space="preserve"> (12 arquivos, ~35 MB, dos quais 2 × 16 MB do Ember).</w:t>
-      </w:r>
-    </w:p>
-    <w:p>
-      <w:pPr>
-        <w:pStyle w:val="ListNumber"/>
-      </w:pPr>
-      <w:r>
-        <w:rPr>
-          <w:b/>
-        </w:rPr>
-        <w:t>Verificação</w:t>
-      </w:r>
-      <w:r>
-        <w:t xml:space="preserve"> (</w:t>
-      </w:r>
-      <w:r>
-        <w:rPr>
-          <w:rFonts w:ascii="Consolas" w:hAnsi="Consolas" w:eastAsia="Consolas"/>
-        </w:rPr>
-        <w:t>verificar.py</w:t>
-      </w:r>
-      <w:r>
-        <w:t xml:space="preserve">, saída em </w:t>
-      </w:r>
-      <w:r>
-        <w:rPr>
-          <w:rFonts w:ascii="Consolas" w:hAnsi="Consolas" w:eastAsia="Consolas"/>
-        </w:rPr>
-        <w:t>dados/processados/verificacao.txt</w:t>
-      </w:r>
-      <w:r>
-        <w:t xml:space="preserve">): sem duplicatas país-ano, sem NaN, valores nas faixas esperadas; três valores sorteados (seed 20260914) conferidos contra os brutos: </w:t>
-      </w:r>
-      <w:r>
-        <w:rPr>
-          <w:rFonts w:ascii="Consolas" w:hAnsi="Consolas" w:eastAsia="Consolas"/>
-        </w:rPr>
-        <w:t>wgi_rule_of_law</w:t>
-      </w:r>
-      <w:r>
-        <w:t xml:space="preserve"> TTO 2013, </w:t>
-      </w:r>
-      <w:r>
-        <w:rPr>
-          <w:rFonts w:ascii="Consolas" w:hAnsi="Consolas" w:eastAsia="Consolas"/>
-        </w:rPr>
-        <w:t>renovaveis_geracao_share</w:t>
-      </w:r>
-      <w:r>
-        <w:t xml:space="preserve"> DOM 2013, </w:t>
-      </w:r>
-      <w:r>
-        <w:rPr>
-          <w:rFonts w:ascii="Consolas" w:hAnsi="Consolas" w:eastAsia="Consolas"/>
-        </w:rPr>
-        <w:t>solar_capacidade</w:t>
-      </w:r>
-      <w:r>
-        <w:t xml:space="preserve"> TTO 2023 — todos idênticos.</w:t>
-      </w:r>
-    </w:p>
-    <w:p>
-      <w:pPr>
-        <w:pStyle w:val="ListNumber"/>
-      </w:pPr>
-      <w:r>
-        <w:rPr>
-          <w:b/>
-        </w:rPr>
-        <w:t>Figuras e derivados</w:t>
-      </w:r>
-      <w:r>
-        <w:t xml:space="preserve"> (</w:t>
-      </w:r>
-      <w:r>
-        <w:rPr>
-          <w:rFonts w:ascii="Consolas" w:hAnsi="Consolas" w:eastAsia="Consolas"/>
-        </w:rPr>
-        <w:t>transform.py</w:t>
-      </w:r>
-      <w:r>
-        <w:t xml:space="preserve">): sete PNGs em </w:t>
-      </w:r>
-      <w:r>
-        <w:rPr>
-          <w:rFonts w:ascii="Consolas" w:hAnsi="Consolas" w:eastAsia="Consolas"/>
-        </w:rPr>
-        <w:t>figuras/</w:t>
-      </w:r>
-      <w:r>
-        <w:t xml:space="preserve">, derivados e tabelas em </w:t>
-      </w:r>
-      <w:r>
-        <w:rPr>
-          <w:rFonts w:ascii="Consolas" w:hAnsi="Consolas" w:eastAsia="Consolas"/>
-        </w:rPr>
-        <w:t>dados/processados/</w:t>
-      </w:r>
-      <w:r>
-        <w:t>. Cada PNG foi aberto e conferido.</w:t>
-      </w:r>
-    </w:p>
-    <w:p>
-      <w:pPr>
-        <w:pStyle w:val="ListNumber"/>
-      </w:pPr>
-      <w:r>
-        <w:rPr>
-          <w:b/>
-        </w:rPr>
-        <w:t>Tabelas em Markdown</w:t>
-      </w:r>
-      <w:r>
-        <w:t xml:space="preserve"> (</w:t>
-      </w:r>
-      <w:r>
-        <w:rPr>
-          <w:rFonts w:ascii="Consolas" w:hAnsi="Consolas" w:eastAsia="Consolas"/>
-        </w:rPr>
-        <w:t>gerar_tabelas.py</w:t>
-      </w:r>
-      <w:r>
-        <w:t xml:space="preserve">, adaptado do projeto Japão): </w:t>
-      </w:r>
-      <w:r>
-        <w:rPr>
-          <w:rFonts w:ascii="Consolas" w:hAnsi="Consolas" w:eastAsia="Consolas"/>
-        </w:rPr>
-        <w:t>01_painel_ultimo_ano_comum.md</w:t>
-      </w:r>
-      <w:r>
-        <w:t xml:space="preserve">, </w:t>
-      </w:r>
-      <w:r>
-        <w:rPr>
-          <w:rFonts w:ascii="Consolas" w:hAnsi="Consolas" w:eastAsia="Consolas"/>
-        </w:rPr>
-        <w:t>02_series_por_pais_anos_selecionados.md</w:t>
-      </w:r>
-      <w:r>
-        <w:t xml:space="preserve">, </w:t>
-      </w:r>
-      <w:r>
-        <w:rPr>
-          <w:rFonts w:ascii="Consolas" w:hAnsi="Consolas" w:eastAsia="Consolas"/>
-        </w:rPr>
-        <w:t>03_jam_marcos_temporais.md</w:t>
-      </w:r>
-      <w:r>
-        <w:t xml:space="preserve">, </w:t>
-      </w:r>
-      <w:r>
-        <w:rPr>
-          <w:rFonts w:ascii="Consolas" w:hAnsi="Consolas" w:eastAsia="Consolas"/>
-        </w:rPr>
-        <w:t>04_derivados.md</w:t>
-      </w:r>
-      <w:r>
-        <w:t xml:space="preserve">, </w:t>
-      </w:r>
-      <w:r>
-        <w:rPr>
-          <w:rFonts w:ascii="Consolas" w:hAnsi="Consolas" w:eastAsia="Consolas"/>
-        </w:rPr>
-        <w:t>05_fatos_chave.md</w:t>
-      </w:r>
-      <w:r>
-        <w:t xml:space="preserve">, </w:t>
-      </w:r>
-      <w:r>
-        <w:rPr>
-          <w:rFonts w:ascii="Consolas" w:hAnsi="Consolas" w:eastAsia="Consolas"/>
-        </w:rPr>
-        <w:t>06_tabelas_manuais.md</w:t>
-      </w:r>
-      <w:r>
-        <w:t xml:space="preserve"> e </w:t>
-      </w:r>
-      <w:r>
-        <w:rPr>
-          <w:rFonts w:ascii="Consolas" w:hAnsi="Consolas" w:eastAsia="Consolas"/>
-        </w:rPr>
-        <w:t>fontes.md</w:t>
-      </w:r>
-      <w:r>
-        <w:t xml:space="preserve">, todos em </w:t>
-      </w:r>
-      <w:r>
-        <w:rPr>
-          <w:rFonts w:ascii="Consolas" w:hAnsi="Consolas" w:eastAsia="Consolas"/>
-        </w:rPr>
-        <w:t>dados/processados/</w:t>
-      </w:r>
-      <w:r>
-        <w:t>.</w:t>
-      </w:r>
-    </w:p>
-    <w:p>
-      <w:pPr>
-        <w:pStyle w:val="ListNumber"/>
-      </w:pPr>
-      <w:r>
-        <w:rPr>
-          <w:b/>
-        </w:rPr>
-        <w:t>Git</w:t>
-      </w:r>
-      <w:r>
-        <w:t xml:space="preserve">: </w:t>
-      </w:r>
-      <w:r>
-        <w:rPr>
-          <w:rFonts w:ascii="Consolas" w:hAnsi="Consolas" w:eastAsia="Consolas"/>
-        </w:rPr>
-        <w:t>git init</w:t>
-      </w:r>
-      <w:r>
-        <w:t xml:space="preserve"> e commit inicial </w:t>
-      </w:r>
-      <w:r>
-        <w:rPr>
-          <w:rFonts w:ascii="Consolas" w:hAnsi="Consolas" w:eastAsia="Consolas"/>
-        </w:rPr>
-        <w:t>822dd96</w:t>
-      </w:r>
-      <w:r>
-        <w:t xml:space="preserve"> (sem </w:t>
-      </w:r>
-      <w:r>
-        <w:rPr>
-          <w:rFonts w:ascii="Consolas" w:hAnsi="Consolas" w:eastAsia="Consolas"/>
-        </w:rPr>
-        <w:t>.venv/</w:t>
-      </w:r>
-      <w:r>
-        <w:t xml:space="preserve"> nem </w:t>
-      </w:r>
-      <w:r>
-        <w:rPr>
-          <w:rFonts w:ascii="Consolas" w:hAnsi="Consolas" w:eastAsia="Consolas"/>
-        </w:rPr>
-        <w:t>__pycache__/</w:t>
-      </w:r>
-      <w:r>
-        <w:t>).</w:t>
+        <w:t>), que devolve CSV por GET para os sete países; deixada como bloco comentado no catálogo, não ativada.</w:t>
       </w:r>
     </w:p>
     <w:p>
@@ -676,20 +495,7 @@
               <w:rPr>
                 <w:sz w:val="18"/>
               </w:rPr>
-              <w:t xml:space="preserve"> = grapher do OWID (</w:t>
-            </w:r>
-            <w:r>
-              <w:rPr>
-                <w:rFonts w:ascii="Consolas" w:hAnsi="Consolas" w:eastAsia="Consolas"/>
-                <w:sz w:val="18"/>
-              </w:rPr>
-              <w:t>installed-solar-pv-capacity.csv</w:t>
-            </w:r>
-            <w:r>
-              <w:rPr>
-                <w:sz w:val="18"/>
-              </w:rPr>
-              <w:t xml:space="preserve">), </w:t>
+              <w:t xml:space="preserve"> = grapher do OWID, </w:t>
             </w:r>
             <w:r>
               <w:rPr>
@@ -715,7 +521,7 @@
               <w:rPr>
                 <w:sz w:val="18"/>
               </w:rPr>
-              <w:t xml:space="preserve">, </w:t>
+              <w:t xml:space="preserve"> (GW → MW), </w:t>
             </w:r>
             <w:r>
               <w:rPr>
@@ -728,7 +534,7 @@
               <w:rPr>
                 <w:sz w:val="18"/>
               </w:rPr>
-              <w:t xml:space="preserve"> registra que é republicação da IRENA, </w:t>
+              <w:t xml:space="preserve"> registra a republicação, </w:t>
             </w:r>
             <w:r>
               <w:rPr>
@@ -761,7 +567,7 @@
               <w:rPr>
                 <w:sz w:val="18"/>
               </w:rPr>
-              <w:t>A IRENA não oferece URL de download direto em CSV: o IRENASTAT (PxWeb) só devolve CSV por POST e o irena.org bloqueia acesso automatizado (HTTP 403). O OWID publica em GW; conferido na API do IRENASTAT que os valores coincidem com a soma PV on-grid + off-grid (diferença ≤ 0,01 MW; única exceção Costa Rica 2012, 0,9 MW) e que a CSP é nula nos sete países, logo "solar total" = fotovoltaica</w:t>
+              <w:t>IRENA sem CSV direto (ver acima)</w:t>
             </w:r>
           </w:p>
         </w:tc>
@@ -837,20 +643,7 @@
               <w:rPr>
                 <w:sz w:val="18"/>
               </w:rPr>
-              <w:t xml:space="preserve"> = </w:t>
-            </w:r>
-            <w:r>
-              <w:rPr>
-                <w:rFonts w:ascii="Consolas" w:hAnsi="Consolas" w:eastAsia="Consolas"/>
-                <w:sz w:val="18"/>
-              </w:rPr>
-              <w:t>release_generation_yearly_global.csv</w:t>
-            </w:r>
-            <w:r>
-              <w:rPr>
-                <w:sz w:val="18"/>
-              </w:rPr>
-              <w:t xml:space="preserve">; </w:t>
+              <w:t xml:space="preserve"> = arquivo anual global do Ember; </w:t>
             </w:r>
             <w:r>
               <w:rPr>
@@ -922,20 +715,7 @@
               <w:rPr>
                 <w:sz w:val="18"/>
               </w:rPr>
-              <w:t>O Ember trocou o formato em julho de 2026: uma linha por área, ano e fonte, métricas em colunas; as colunas Category/Subcategory/Variable/Unit/Value não existem mais. O arquivo "Europe only" (</w:t>
-            </w:r>
-            <w:r>
-              <w:rPr>
-                <w:rFonts w:ascii="Consolas" w:hAnsi="Consolas" w:eastAsia="Consolas"/>
-                <w:sz w:val="18"/>
-              </w:rPr>
-              <w:t>_lower</w:t>
-            </w:r>
-            <w:r>
-              <w:rPr>
-                <w:sz w:val="18"/>
-              </w:rPr>
-              <w:t>) não tem os países do grupo</w:t>
+              <w:t>Formato novo do Ember</w:t>
             </w:r>
           </w:p>
         </w:tc>
@@ -1043,7 +823,7 @@
               <w:rPr>
                 <w:sz w:val="18"/>
               </w:rPr>
-              <w:t xml:space="preserve"> passou a registrar a cobertura efetiva e as lacunas conferidas</w:t>
+              <w:t xml:space="preserve"> registra cobertura efetiva e lacunas</w:t>
             </w:r>
           </w:p>
         </w:tc>
@@ -1063,103 +843,7 @@
               <w:rPr>
                 <w:sz w:val="18"/>
               </w:rPr>
-              <w:t>Exigência de documentar lacunas; a dívida no WDI é insuficiente para comparação</w:t>
-            </w:r>
-          </w:p>
-        </w:tc>
-      </w:tr>
-      <w:tr>
-        <w:tc>
-          <w:tcPr>
-            <w:tcW w:type="dxa" w:w="3324"/>
-            <w:tcBorders>
-              <w:top w:val="single" w:sz="4" w:color="999999"/>
-              <w:left w:val="single" w:sz="4" w:color="999999"/>
-              <w:bottom w:val="single" w:sz="4" w:color="999999"/>
-              <w:right w:val="single" w:sz="4" w:color="999999"/>
-            </w:tcBorders>
-          </w:tcPr>
-          <w:p>
-            <w:r/>
-            <w:r>
-              <w:rPr>
-                <w:rFonts w:ascii="Consolas" w:hAnsi="Consolas" w:eastAsia="Consolas"/>
-                <w:sz w:val="18"/>
-              </w:rPr>
-              <w:t>config/series.yaml</w:t>
-            </w:r>
-            <w:r>
-              <w:rPr>
-                <w:sz w:val="18"/>
-              </w:rPr>
-              <w:t xml:space="preserve"> — bloco comentado </w:t>
-            </w:r>
-            <w:r>
-              <w:rPr>
-                <w:rFonts w:ascii="Consolas" w:hAnsi="Consolas" w:eastAsia="Consolas"/>
-                <w:sz w:val="18"/>
-              </w:rPr>
-              <w:t>divida_bruta_weo</w:t>
-            </w:r>
-          </w:p>
-        </w:tc>
-        <w:tc>
-          <w:tcPr>
-            <w:tcW w:type="dxa" w:w="3324"/>
-            <w:tcBorders>
-              <w:top w:val="single" w:sz="4" w:color="999999"/>
-              <w:left w:val="single" w:sz="4" w:color="999999"/>
-              <w:bottom w:val="single" w:sz="4" w:color="999999"/>
-              <w:right w:val="single" w:sz="4" w:color="999999"/>
-            </w:tcBorders>
-          </w:tcPr>
-          <w:p>
-            <w:r/>
-            <w:r>
-              <w:rPr>
-                <w:sz w:val="18"/>
-              </w:rPr>
-              <w:t xml:space="preserve">Entrada pronta (não ativada) para </w:t>
-            </w:r>
-            <w:r>
-              <w:rPr>
-                <w:rFonts w:ascii="Consolas" w:hAnsi="Consolas" w:eastAsia="Consolas"/>
-                <w:sz w:val="18"/>
-              </w:rPr>
-              <w:t>GGXWDG_NGDP</w:t>
-            </w:r>
-            <w:r>
-              <w:rPr>
-                <w:sz w:val="18"/>
-              </w:rPr>
-              <w:t xml:space="preserve"> do FMI WEO via API SDMX 2.1, usando o extrator </w:t>
-            </w:r>
-            <w:r>
-              <w:rPr>
-                <w:rFonts w:ascii="Consolas" w:hAnsi="Consolas" w:eastAsia="Consolas"/>
-                <w:sz w:val="18"/>
-              </w:rPr>
-              <w:t>csv_url</w:t>
-            </w:r>
-          </w:p>
-        </w:tc>
-        <w:tc>
-          <w:tcPr>
-            <w:tcW w:type="dxa" w:w="3324"/>
-            <w:tcBorders>
-              <w:top w:val="single" w:sz="4" w:color="999999"/>
-              <w:left w:val="single" w:sz="4" w:color="999999"/>
-              <w:bottom w:val="single" w:sz="4" w:color="999999"/>
-              <w:right w:val="single" w:sz="4" w:color="999999"/>
-            </w:tcBorders>
-          </w:tcPr>
-          <w:p>
-            <w:r/>
-            <w:r>
-              <w:rPr>
-                <w:sz w:val="18"/>
-              </w:rPr>
-              <w:t>Alternativa pedida no prompt; não implementada sem autorização</w:t>
+              <w:t>Exigência de documentar lacunas; dívida no WDI insuficiente para comparação</w:t>
             </w:r>
           </w:p>
         </w:tc>
@@ -1274,20 +958,7 @@
               <w:rPr>
                 <w:sz w:val="18"/>
               </w:rPr>
-              <w:t xml:space="preserve"> descrevem o que as tabelas manuais contêm (fontes, unidades, </w:t>
-            </w:r>
-            <w:r>
-              <w:rPr>
-                <w:rFonts w:ascii="Consolas" w:hAnsi="Consolas" w:eastAsia="Consolas"/>
-                <w:sz w:val="18"/>
-              </w:rPr>
-              <w:t>valor</w:t>
-            </w:r>
-            <w:r>
-              <w:rPr>
-                <w:sz w:val="18"/>
-              </w:rPr>
-              <w:t xml:space="preserve"> = MWh)</w:t>
+              <w:t xml:space="preserve"> descrevem o conteúdo real das tabelas manuais</w:t>
             </w:r>
           </w:p>
         </w:tc>
@@ -1320,7 +991,7 @@
               <w:rPr>
                 <w:sz w:val="18"/>
               </w:rPr>
-              <w:t xml:space="preserve"> e o conteúdo real das tabelas</w:t>
+              <w:t xml:space="preserve"> e as tabelas</w:t>
             </w:r>
           </w:p>
         </w:tc>
@@ -1376,7 +1047,7 @@
               <w:rPr>
                 <w:sz w:val="18"/>
               </w:rPr>
-              <w:t xml:space="preserve"> (multiplica o valor) e aplicação de </w:t>
+              <w:t xml:space="preserve"> e aplicação de </w:t>
             </w:r>
             <w:r>
               <w:rPr>
@@ -1409,7 +1080,7 @@
               <w:rPr>
                 <w:sz w:val="18"/>
               </w:rPr>
-              <w:t>Converter GW→MW de forma declarada; o recorte de período passou a valer para todas as fontes</w:t>
+              <w:t>Conversão GW → MW declarada; recorte de período igual ao do Banco Mundial</w:t>
             </w:r>
           </w:p>
         </w:tc>
@@ -1535,20 +1206,7 @@
               <w:rPr>
                 <w:sz w:val="18"/>
               </w:rPr>
-              <w:t>Legenda das figuras de linha à direita do gráfico (</w:t>
-            </w:r>
-            <w:r>
-              <w:rPr>
-                <w:rFonts w:ascii="Consolas" w:hAnsi="Consolas" w:eastAsia="Consolas"/>
-                <w:sz w:val="18"/>
-              </w:rPr>
-              <w:t>legenda_fora</w:t>
-            </w:r>
-            <w:r>
-              <w:rPr>
-                <w:sz w:val="18"/>
-              </w:rPr>
-              <w:t xml:space="preserve">), </w:t>
+              <w:t xml:space="preserve">Legenda das figuras de linha fora do gráfico, </w:t>
             </w:r>
             <w:r>
               <w:rPr>
@@ -1561,7 +1219,7 @@
               <w:rPr>
                 <w:sz w:val="18"/>
               </w:rPr>
-              <w:t xml:space="preserve"> ao salvar, rótulo do eixo y da convergência em duas linhas</w:t>
+              <w:t>, rótulo do eixo y da convergência em duas linhas</w:t>
             </w:r>
           </w:p>
         </w:tc>
@@ -1581,46 +1239,7 @@
               <w:rPr>
                 <w:sz w:val="18"/>
               </w:rPr>
-              <w:t xml:space="preserve">Só renderização: a legenda cobria linhas em </w:t>
-            </w:r>
-            <w:r>
-              <w:rPr>
-                <w:rFonts w:ascii="Consolas" w:hAnsi="Consolas" w:eastAsia="Consolas"/>
-                <w:sz w:val="18"/>
-              </w:rPr>
-              <w:t>fig_energia_importada</w:t>
-            </w:r>
-            <w:r>
-              <w:rPr>
-                <w:sz w:val="18"/>
-              </w:rPr>
-              <w:t xml:space="preserve">, </w:t>
-            </w:r>
-            <w:r>
-              <w:rPr>
-                <w:rFonts w:ascii="Consolas" w:hAnsi="Consolas" w:eastAsia="Consolas"/>
-                <w:sz w:val="18"/>
-              </w:rPr>
-              <w:t>fig_wgi_rule_of_law</w:t>
-            </w:r>
-            <w:r>
-              <w:rPr>
-                <w:sz w:val="18"/>
-              </w:rPr>
-              <w:t xml:space="preserve"> e </w:t>
-            </w:r>
-            <w:r>
-              <w:rPr>
-                <w:rFonts w:ascii="Consolas" w:hAnsi="Consolas" w:eastAsia="Consolas"/>
-                <w:sz w:val="18"/>
-              </w:rPr>
-              <w:t>fig_idh</w:t>
-            </w:r>
-            <w:r>
-              <w:rPr>
-                <w:sz w:val="18"/>
-              </w:rPr>
-              <w:t>; o rótulo longo cortava no topo</w:t>
+              <w:t>Só renderização: a legenda cobria linhas em três figuras</w:t>
             </w:r>
           </w:p>
         </w:tc>
@@ -1669,7 +1288,20 @@
               <w:rPr>
                 <w:sz w:val="18"/>
               </w:rPr>
-              <w:t>Resumo por série, sinalizações e conferência aleatória contra os brutos</w:t>
+              <w:t>Resumo por série, sinalizações e conferência aleatória contra os brutos (</w:t>
+            </w:r>
+            <w:r>
+              <w:rPr>
+                <w:rFonts w:ascii="Consolas" w:hAnsi="Consolas" w:eastAsia="Consolas"/>
+                <w:sz w:val="18"/>
+              </w:rPr>
+              <w:t>dados/processados/verificacao.txt</w:t>
+            </w:r>
+            <w:r>
+              <w:rPr>
+                <w:sz w:val="18"/>
+              </w:rPr>
+              <w:t>)</w:t>
             </w:r>
           </w:p>
         </w:tc>
@@ -1689,14 +1321,7 @@
               <w:rPr>
                 <w:sz w:val="18"/>
               </w:rPr>
-              <w:t xml:space="preserve">Tarefa 5 do prompt; gera </w:t>
-            </w:r>
-            <w:r>
-              <w:rPr>
-                <w:rFonts w:ascii="Consolas" w:hAnsi="Consolas" w:eastAsia="Consolas"/>
-                <w:sz w:val="18"/>
-              </w:rPr>
-              <w:t>dados/processados/verificacao.txt</w:t>
+              <w:t>Tarefa 5 do prompt</w:t>
             </w:r>
           </w:p>
         </w:tc>
@@ -1745,7 +1370,7 @@
               <w:rPr>
                 <w:sz w:val="18"/>
               </w:rPr>
-              <w:t>Adaptação do script do projeto Japão: país, comparadores, nomes e referência lidos do catálogo; fallback quando nenhum ano é comum a todos os países (dívida)</w:t>
+              <w:t>Adaptação do script do projeto Japão: país, comparadores, nomes e referência lidos do catálogo</w:t>
             </w:r>
           </w:p>
         </w:tc>
@@ -1808,7 +1433,7 @@
               <w:rPr>
                 <w:sz w:val="18"/>
               </w:rPr>
-              <w:t>11 linhas (2015–2025), tarifa média da JPS em US$/kWh como publicada pelo MSETT (Jamaica Energy Statistics, tabela "JPS Rate Charges", dados da JPS), valor original em J$/kWh, coluna extra com a tarifa residencial (Rate 10); 2015 do IRP 2018</w:t>
+              <w:t>11 linhas (2015–2025): tarifa média da JPS em US$/kWh como publicada pelo MSETT (Jamaica Energy Statistics, tabela "JPS Rate Charges", dados da JPS), valor original em J$/kWh, coluna extra com a tarifa residencial (Rate 10); 2015 do IRP 2018</w:t>
             </w:r>
           </w:p>
         </w:tc>
@@ -1828,7 +1453,7 @@
               <w:rPr>
                 <w:sz w:val="18"/>
               </w:rPr>
-              <w:t>Documentos da JPS (jpsco.com) inacessíveis por bloqueio anti-bot (Incapsula); o MSETT publica a série oficial com fonte JPS</w:t>
+              <w:t>O site da JPS (jpsco.com) bloqueia acesso automatizado; o MSETT publica a série oficial com fonte JPS</w:t>
             </w:r>
           </w:p>
         </w:tc>
@@ -1896,132 +1521,6 @@
           </w:p>
         </w:tc>
       </w:tr>
-      <w:tr>
-        <w:tc>
-          <w:tcPr>
-            <w:tcW w:type="dxa" w:w="3324"/>
-            <w:tcBorders>
-              <w:top w:val="single" w:sz="4" w:color="999999"/>
-              <w:left w:val="single" w:sz="4" w:color="999999"/>
-              <w:bottom w:val="single" w:sz="4" w:color="999999"/>
-              <w:right w:val="single" w:sz="4" w:color="999999"/>
-            </w:tcBorders>
-          </w:tcPr>
-          <w:p>
-            <w:r/>
-            <w:r>
-              <w:rPr>
-                <w:rFonts w:ascii="Consolas" w:hAnsi="Consolas" w:eastAsia="Consolas"/>
-                <w:sz w:val="18"/>
-              </w:rPr>
-              <w:t>README.md</w:t>
-            </w:r>
-          </w:p>
-        </w:tc>
-        <w:tc>
-          <w:tcPr>
-            <w:tcW w:type="dxa" w:w="3324"/>
-            <w:tcBorders>
-              <w:top w:val="single" w:sz="4" w:color="999999"/>
-              <w:left w:val="single" w:sz="4" w:color="999999"/>
-              <w:bottom w:val="single" w:sz="4" w:color="999999"/>
-              <w:right w:val="single" w:sz="4" w:color="999999"/>
-            </w:tcBorders>
-          </w:tcPr>
-          <w:p>
-            <w:r/>
-            <w:r>
-              <w:rPr>
-                <w:sz w:val="18"/>
-              </w:rPr>
-              <w:t>Seção "Antes da primeira execução" substituída por "Estado do catálogo"; novos scripts na estrutura e no "Como rodar"</w:t>
-            </w:r>
-          </w:p>
-        </w:tc>
-        <w:tc>
-          <w:tcPr>
-            <w:tcW w:type="dxa" w:w="3324"/>
-            <w:tcBorders>
-              <w:top w:val="single" w:sz="4" w:color="999999"/>
-              <w:left w:val="single" w:sz="4" w:color="999999"/>
-              <w:bottom w:val="single" w:sz="4" w:color="999999"/>
-              <w:right w:val="single" w:sz="4" w:color="999999"/>
-            </w:tcBorders>
-          </w:tcPr>
-          <w:p>
-            <w:r/>
-            <w:r>
-              <w:rPr>
-                <w:sz w:val="18"/>
-              </w:rPr>
-              <w:t>Instruções anteriores ficaram obsoletas</w:t>
-            </w:r>
-          </w:p>
-        </w:tc>
-      </w:tr>
-      <w:tr>
-        <w:tc>
-          <w:tcPr>
-            <w:tcW w:type="dxa" w:w="3324"/>
-            <w:tcBorders>
-              <w:top w:val="single" w:sz="4" w:color="999999"/>
-              <w:left w:val="single" w:sz="4" w:color="999999"/>
-              <w:bottom w:val="single" w:sz="4" w:color="999999"/>
-              <w:right w:val="single" w:sz="4" w:color="999999"/>
-            </w:tcBorders>
-          </w:tcPr>
-          <w:p>
-            <w:r/>
-            <w:r>
-              <w:rPr>
-                <w:rFonts w:ascii="Consolas" w:hAnsi="Consolas" w:eastAsia="Consolas"/>
-                <w:sz w:val="18"/>
-              </w:rPr>
-              <w:t>uso_de_ia_AM1.md</w:t>
-            </w:r>
-          </w:p>
-        </w:tc>
-        <w:tc>
-          <w:tcPr>
-            <w:tcW w:type="dxa" w:w="3324"/>
-            <w:tcBorders>
-              <w:top w:val="single" w:sz="4" w:color="999999"/>
-              <w:left w:val="single" w:sz="4" w:color="999999"/>
-              <w:bottom w:val="single" w:sz="4" w:color="999999"/>
-              <w:right w:val="single" w:sz="4" w:color="999999"/>
-            </w:tcBorders>
-          </w:tcPr>
-          <w:p>
-            <w:r/>
-            <w:r>
-              <w:rPr>
-                <w:sz w:val="18"/>
-              </w:rPr>
-              <w:t>Esta seção</w:t>
-            </w:r>
-          </w:p>
-        </w:tc>
-        <w:tc>
-          <w:tcPr>
-            <w:tcW w:type="dxa" w:w="3324"/>
-            <w:tcBorders>
-              <w:top w:val="single" w:sz="4" w:color="999999"/>
-              <w:left w:val="single" w:sz="4" w:color="999999"/>
-              <w:bottom w:val="single" w:sz="4" w:color="999999"/>
-              <w:right w:val="single" w:sz="4" w:color="999999"/>
-            </w:tcBorders>
-          </w:tcPr>
-          <w:p>
-            <w:r/>
-            <w:r>
-              <w:rPr>
-                <w:sz w:val="18"/>
-              </w:rPr>
-              <w:t>Exigência da atividade</w:t>
-            </w:r>
-          </w:p>
-        </w:tc>
-      </w:tr>
     </w:tbl>
     <w:p/>
     <w:p>
@@ -2043,7 +1542,7 @@
         <w:pStyle w:val="Heading4"/>
       </w:pPr>
       <w:r>
-        <w:t>Lacunas e cautelas registradas</w:t>
+        <w:t>Execução e verificação</w:t>
       </w:r>
     </w:p>
     <w:p>
@@ -2051,7 +1550,102 @@
         <w:pStyle w:val="ListBullet"/>
       </w:pPr>
       <w:r>
-        <w:t xml:space="preserve">Agregado LCN só existe no Banco Mundial (WDI; não no WGI); ausente no HDR, HCI, OWID e Ember. Barbados não tem </w:t>
+        <w:rPr>
+          <w:rFonts w:ascii="Consolas" w:hAnsi="Consolas" w:eastAsia="Consolas"/>
+        </w:rPr>
+        <w:t>run_all.py</w:t>
+      </w:r>
+      <w:r>
+        <w:t xml:space="preserve">: 13 de 13 séries com status </w:t>
+      </w:r>
+      <w:r>
+        <w:rPr>
+          <w:rFonts w:ascii="Consolas" w:hAnsi="Consolas" w:eastAsia="Consolas"/>
+        </w:rPr>
+        <w:t>ok</w:t>
+      </w:r>
+      <w:r>
+        <w:t xml:space="preserve"> em </w:t>
+      </w:r>
+      <w:r>
+        <w:rPr>
+          <w:rFonts w:ascii="Consolas" w:hAnsi="Consolas" w:eastAsia="Consolas"/>
+        </w:rPr>
+        <w:t>log_extracao.csv</w:t>
+      </w:r>
+      <w:r>
+        <w:t xml:space="preserve">; brutos datados em </w:t>
+      </w:r>
+      <w:r>
+        <w:rPr>
+          <w:rFonts w:ascii="Consolas" w:hAnsi="Consolas" w:eastAsia="Consolas"/>
+        </w:rPr>
+        <w:t>dados/brutos/</w:t>
+      </w:r>
+      <w:r>
+        <w:t>.</w:t>
+      </w:r>
+    </w:p>
+    <w:p>
+      <w:pPr>
+        <w:pStyle w:val="ListBullet"/>
+      </w:pPr>
+      <w:r>
+        <w:rPr>
+          <w:rFonts w:ascii="Consolas" w:hAnsi="Consolas" w:eastAsia="Consolas"/>
+        </w:rPr>
+        <w:t>verificar.py</w:t>
+      </w:r>
+      <w:r>
+        <w:t>: sem duplicatas país-ano, sem NaN, valores nas faixas esperadas; três valores sorteados (seed 20260914) conferidos contra os brutos, todos idênticos.</w:t>
+      </w:r>
+    </w:p>
+    <w:p>
+      <w:pPr>
+        <w:pStyle w:val="ListBullet"/>
+      </w:pPr>
+      <w:r>
+        <w:rPr>
+          <w:rFonts w:ascii="Consolas" w:hAnsi="Consolas" w:eastAsia="Consolas"/>
+        </w:rPr>
+        <w:t>transform.py</w:t>
+      </w:r>
+      <w:r>
+        <w:t xml:space="preserve"> e </w:t>
+      </w:r>
+      <w:r>
+        <w:rPr>
+          <w:rFonts w:ascii="Consolas" w:hAnsi="Consolas" w:eastAsia="Consolas"/>
+        </w:rPr>
+        <w:t>gerar_tabelas.py</w:t>
+      </w:r>
+      <w:r>
+        <w:t xml:space="preserve">: sete figuras (cada PNG aberto e conferido), derivados e tabelas em Markdown em </w:t>
+      </w:r>
+      <w:r>
+        <w:rPr>
+          <w:rFonts w:ascii="Consolas" w:hAnsi="Consolas" w:eastAsia="Consolas"/>
+        </w:rPr>
+        <w:t>dados/processados/</w:t>
+      </w:r>
+      <w:r>
+        <w:t>.</w:t>
+      </w:r>
+    </w:p>
+    <w:p>
+      <w:pPr>
+        <w:pStyle w:val="Heading4"/>
+      </w:pPr>
+      <w:r>
+        <w:t>Lacunas registradas</w:t>
+      </w:r>
+    </w:p>
+    <w:p>
+      <w:pPr>
+        <w:pStyle w:val="ListBullet"/>
+      </w:pPr>
+      <w:r>
+        <w:t xml:space="preserve">Agregado LCN só existe no WDI; ausente no HDR, HCI, WGI, OWID e Ember. Barbados não tem </w:t>
       </w:r>
       <w:r>
         <w:rPr>
@@ -2092,30 +1686,7 @@
         <w:t>divida_publica</w:t>
       </w:r>
       <w:r>
-        <w:t xml:space="preserve"> (WDI): Jamaica 1990–2020 sem 2018; comparadores muito irregulares (Panamá sem dado; Trinidad e Tobago só 2006–2007; República Dominicana 1996–1999). A alternativa do FMI WEO (</w:t>
-      </w:r>
-      <w:r>
-        <w:rPr>
-          <w:rFonts w:ascii="Consolas" w:hAnsi="Consolas" w:eastAsia="Consolas"/>
-        </w:rPr>
-        <w:t>GGXWDG_NGDP</w:t>
-      </w:r>
-      <w:r>
-        <w:t>) foi testada: sete países com dados anuais (Jamaica 1999–2024 observados, ano fiscal), projeções até 2031 a excluir; bloco pronto no catálogo, não ativado.</w:t>
-      </w:r>
-    </w:p>
-    <w:p>
-      <w:pPr>
-        <w:pStyle w:val="ListBullet"/>
-      </w:pPr>
-      <w:r>
-        <w:rPr>
-          <w:rFonts w:ascii="Consolas" w:hAnsi="Consolas" w:eastAsia="Consolas"/>
-        </w:rPr>
-        <w:t>solar_capacidade</w:t>
-      </w:r>
-      <w:r>
-        <w:t xml:space="preserve"> vem da republicação do OWID, não da IRENA diretamente (motivo e conferência no catálogo).</w:t>
+        <w:t xml:space="preserve"> (WDI): Jamaica 1990–2020 sem 2018; comparadores muito irregulares (Panamá sem dado; Trinidad e Tobago só 2006–2007; República Dominicana 1996–1999).</w:t>
       </w:r>
     </w:p>
     <w:p>
@@ -2129,12 +1700,7 @@
         <w:t>tarifa_eletricidade</w:t>
       </w:r>
       <w:r>
-        <w:t>: US$ arredondado a 2 casas pela própria fonte. HESS com composição divergente entre fontes (OUR na inauguração: 21 MW baterias + 3,5 MW flywheel; IRP 2022: 20 MW + 4,5 MW).</w:t>
-      </w:r>
-    </w:p>
-    <w:p>
-      <w:r>
-        <w:t>O relatório final entregue no chat ao fim desta sessão está transcrito no Anexo B; a tabela de períodos e últimos valores foi atualizada na Sessão 3, depois da mudança do período para 2025.</w:t>
+        <w:t>: US$ arredondado a 2 casas pela própria fonte. HESS com composição divergente entre fontes (OUR: 21 MW baterias + 3,5 MW flywheel; IRP 2022: 20 MW + 4,5 MW).</w:t>
       </w:r>
     </w:p>
     <w:p>
@@ -2142,7 +1708,7 @@
         <w:pStyle w:val="Heading3"/>
       </w:pPr>
       <w:r>
-        <w:t>Sessão 3 — 2026-09-14 (Claude Code): decisões do aluno aplicadas</w:t>
+        <w:t>Sessão 3 — Claude Code: decisões do aluno sobre os dados</w:t>
       </w:r>
     </w:p>
     <w:p>
@@ -2150,7 +1716,7 @@
         <w:rPr>
           <w:b/>
         </w:rPr>
-        <w:t>Prompt (transcrito no Anexo C):</w:t>
+        <w:t>Prompt (Anexo C):</w:t>
       </w:r>
       <w:r>
         <w:t xml:space="preserve"> usar </w:t>
@@ -2180,7 +1746,7 @@
         <w:t>periodo.fim</w:t>
       </w:r>
       <w:r>
-        <w:t xml:space="preserve"> = 2025; montar um docx com as interações de IA; organizar as pastas e subpastas no padrão do projeto anterior, sem commit nem push.</w:t>
+        <w:t xml:space="preserve"> = 2025.</w:t>
       </w:r>
     </w:p>
     <w:p>
@@ -2337,7 +1903,7 @@
               <w:rPr>
                 <w:sz w:val="18"/>
               </w:rPr>
-              <w:t xml:space="preserve"> como quinta dimensão do PDF (a dívida e o WGI seguem no catálogo como apoio); nova série auxiliar </w:t>
+              <w:t xml:space="preserve"> como quinta dimensão (dívida e WGI seguem como apoio); nova série auxiliar </w:t>
             </w:r>
             <w:r>
               <w:rPr>
@@ -2403,7 +1969,7 @@
               <w:rPr>
                 <w:sz w:val="18"/>
               </w:rPr>
-              <w:t xml:space="preserve">Decisões do aluno; a conversão de moeda passa a ser feita no código, com a série de câmbio no catálogo e em </w:t>
+              <w:t xml:space="preserve">Decisões do aluno; a conversão de moeda passa a ser feita no código, com a série no catálogo e em </w:t>
             </w:r>
             <w:r>
               <w:rPr>
@@ -2453,7 +2019,7 @@
               <w:rPr>
                 <w:sz w:val="18"/>
               </w:rPr>
-              <w:t xml:space="preserve">Colunas novas </w:t>
+              <w:t xml:space="preserve">Colunas </w:t>
             </w:r>
             <w:r>
               <w:rPr>
@@ -2492,7 +2058,7 @@
               <w:rPr>
                 <w:sz w:val="18"/>
               </w:rPr>
-              <w:t xml:space="preserve"> registra que a composição adotada é a da OUR (discurso do Diretor-Geral na inauguração, 2019-12-11) e que a do IRP 2022 (20 + 4,5 MW) é divergente e não foi usada</w:t>
+              <w:t xml:space="preserve"> registra a composição da OUR como adotada e a do IRP 2022 como divergente</w:t>
             </w:r>
           </w:p>
         </w:tc>
@@ -2581,7 +2147,7 @@
               <w:rPr>
                 <w:sz w:val="18"/>
               </w:rPr>
-              <w:t>: J$/kWh ÷ câmbio médio anual, com a residencial em US$ e a média do sistema recalculada para conferir o US$ publicado pelo MSETT</w:t>
+              <w:t>: J$/kWh ÷ câmbio médio anual, com a residencial em US$ e a média do sistema recalculada para conferir o US$ publicado</w:t>
             </w:r>
           </w:p>
         </w:tc>
@@ -2601,7 +2167,7 @@
               <w:rPr>
                 <w:sz w:val="18"/>
               </w:rPr>
-              <w:t>Decisão do aluno; sem alterar a tabela manual</w:t>
+              <w:t>Decisão do aluno; a tabela manual não muda</w:t>
             </w:r>
           </w:p>
         </w:tc>
@@ -2689,303 +2255,6 @@
           </w:p>
         </w:tc>
       </w:tr>
-      <w:tr>
-        <w:tc>
-          <w:tcPr>
-            <w:tcW w:type="dxa" w:w="3324"/>
-            <w:tcBorders>
-              <w:top w:val="single" w:sz="4" w:color="999999"/>
-              <w:left w:val="single" w:sz="4" w:color="999999"/>
-              <w:bottom w:val="single" w:sz="4" w:color="999999"/>
-              <w:right w:val="single" w:sz="4" w:color="999999"/>
-            </w:tcBorders>
-          </w:tcPr>
-          <w:p>
-            <w:r/>
-            <w:r>
-              <w:rPr>
-                <w:rFonts w:ascii="Consolas" w:hAnsi="Consolas" w:eastAsia="Consolas"/>
-                <w:sz w:val="18"/>
-              </w:rPr>
-              <w:t>README.md</w:t>
-            </w:r>
-          </w:p>
-        </w:tc>
-        <w:tc>
-          <w:tcPr>
-            <w:tcW w:type="dxa" w:w="3324"/>
-            <w:tcBorders>
-              <w:top w:val="single" w:sz="4" w:color="999999"/>
-              <w:left w:val="single" w:sz="4" w:color="999999"/>
-              <w:bottom w:val="single" w:sz="4" w:color="999999"/>
-              <w:right w:val="single" w:sz="4" w:color="999999"/>
-            </w:tcBorders>
-          </w:tcPr>
-          <w:p>
-            <w:r/>
-            <w:r>
-              <w:rPr>
-                <w:sz w:val="18"/>
-              </w:rPr>
-              <w:t>Itens 4, 6, 7 e 8 do "Estado do catálogo" com as decisões</w:t>
-            </w:r>
-          </w:p>
-        </w:tc>
-        <w:tc>
-          <w:tcPr>
-            <w:tcW w:type="dxa" w:w="3324"/>
-            <w:tcBorders>
-              <w:top w:val="single" w:sz="4" w:color="999999"/>
-              <w:left w:val="single" w:sz="4" w:color="999999"/>
-              <w:bottom w:val="single" w:sz="4" w:color="999999"/>
-              <w:right w:val="single" w:sz="4" w:color="999999"/>
-            </w:tcBorders>
-          </w:tcPr>
-          <w:p>
-            <w:r/>
-            <w:r>
-              <w:rPr>
-                <w:sz w:val="18"/>
-              </w:rPr>
-              <w:t>Documentação</w:t>
-            </w:r>
-          </w:p>
-        </w:tc>
-      </w:tr>
-      <w:tr>
-        <w:tc>
-          <w:tcPr>
-            <w:tcW w:type="dxa" w:w="3324"/>
-            <w:tcBorders>
-              <w:top w:val="single" w:sz="4" w:color="999999"/>
-              <w:left w:val="single" w:sz="4" w:color="999999"/>
-              <w:bottom w:val="single" w:sz="4" w:color="999999"/>
-              <w:right w:val="single" w:sz="4" w:color="999999"/>
-            </w:tcBorders>
-          </w:tcPr>
-          <w:p>
-            <w:r/>
-            <w:r>
-              <w:rPr>
-                <w:rFonts w:ascii="Consolas" w:hAnsi="Consolas" w:eastAsia="Consolas"/>
-                <w:sz w:val="18"/>
-              </w:rPr>
-              <w:t>.gitattributes</w:t>
-            </w:r>
-            <w:r>
-              <w:rPr>
-                <w:sz w:val="18"/>
-              </w:rPr>
-              <w:t xml:space="preserve"> (novo)</w:t>
-            </w:r>
-          </w:p>
-        </w:tc>
-        <w:tc>
-          <w:tcPr>
-            <w:tcW w:type="dxa" w:w="3324"/>
-            <w:tcBorders>
-              <w:top w:val="single" w:sz="4" w:color="999999"/>
-              <w:left w:val="single" w:sz="4" w:color="999999"/>
-              <w:bottom w:val="single" w:sz="4" w:color="999999"/>
-              <w:right w:val="single" w:sz="4" w:color="999999"/>
-            </w:tcBorders>
-          </w:tcPr>
-          <w:p>
-            <w:r/>
-            <w:r>
-              <w:rPr>
-                <w:rFonts w:ascii="Consolas" w:hAnsi="Consolas" w:eastAsia="Consolas"/>
-                <w:sz w:val="18"/>
-              </w:rPr>
-              <w:t>* text=auto</w:t>
-            </w:r>
-            <w:r>
-              <w:rPr>
-                <w:sz w:val="18"/>
-              </w:rPr>
-              <w:t>, PNG/docx/PDF binários</w:t>
-            </w:r>
-          </w:p>
-        </w:tc>
-        <w:tc>
-          <w:tcPr>
-            <w:tcW w:type="dxa" w:w="3324"/>
-            <w:tcBorders>
-              <w:top w:val="single" w:sz="4" w:color="999999"/>
-              <w:left w:val="single" w:sz="4" w:color="999999"/>
-              <w:bottom w:val="single" w:sz="4" w:color="999999"/>
-              <w:right w:val="single" w:sz="4" w:color="999999"/>
-            </w:tcBorders>
-          </w:tcPr>
-          <w:p>
-            <w:r/>
-            <w:r>
-              <w:rPr>
-                <w:sz w:val="18"/>
-              </w:rPr>
-              <w:t>Evitar avisos LF/CRLF entre sistemas ao montar o repositório</w:t>
-            </w:r>
-          </w:p>
-        </w:tc>
-      </w:tr>
-      <w:tr>
-        <w:tc>
-          <w:tcPr>
-            <w:tcW w:type="dxa" w:w="3324"/>
-            <w:tcBorders>
-              <w:top w:val="single" w:sz="4" w:color="999999"/>
-              <w:left w:val="single" w:sz="4" w:color="999999"/>
-              <w:bottom w:val="single" w:sz="4" w:color="999999"/>
-              <w:right w:val="single" w:sz="4" w:color="999999"/>
-            </w:tcBorders>
-          </w:tcPr>
-          <w:p>
-            <w:r/>
-            <w:r>
-              <w:rPr>
-                <w:rFonts w:ascii="Consolas" w:hAnsi="Consolas" w:eastAsia="Consolas"/>
-                <w:sz w:val="18"/>
-              </w:rPr>
-              <w:t>uso_de_ia_AM1.md</w:t>
-            </w:r>
-            <w:r>
-              <w:rPr>
-                <w:sz w:val="18"/>
-              </w:rPr>
-              <w:t xml:space="preserve"> e </w:t>
-            </w:r>
-            <w:r>
-              <w:rPr>
-                <w:rFonts w:ascii="Consolas" w:hAnsi="Consolas" w:eastAsia="Consolas"/>
-                <w:sz w:val="18"/>
-              </w:rPr>
-              <w:t>uso_de_ia_AM1.docx</w:t>
-            </w:r>
-          </w:p>
-        </w:tc>
-        <w:tc>
-          <w:tcPr>
-            <w:tcW w:type="dxa" w:w="3324"/>
-            <w:tcBorders>
-              <w:top w:val="single" w:sz="4" w:color="999999"/>
-              <w:left w:val="single" w:sz="4" w:color="999999"/>
-              <w:bottom w:val="single" w:sz="4" w:color="999999"/>
-              <w:right w:val="single" w:sz="4" w:color="999999"/>
-            </w:tcBorders>
-          </w:tcPr>
-          <w:p>
-            <w:r/>
-            <w:r>
-              <w:rPr>
-                <w:sz w:val="18"/>
-              </w:rPr>
-              <w:t>Esta seção, o Anexo com as interações e a versão docx gerada a partir do Markdown (python-docx, fora do projeto)</w:t>
-            </w:r>
-          </w:p>
-        </w:tc>
-        <w:tc>
-          <w:tcPr>
-            <w:tcW w:type="dxa" w:w="3324"/>
-            <w:tcBorders>
-              <w:top w:val="single" w:sz="4" w:color="999999"/>
-              <w:left w:val="single" w:sz="4" w:color="999999"/>
-              <w:bottom w:val="single" w:sz="4" w:color="999999"/>
-              <w:right w:val="single" w:sz="4" w:color="999999"/>
-            </w:tcBorders>
-          </w:tcPr>
-          <w:p>
-            <w:r/>
-            <w:r>
-              <w:rPr>
-                <w:sz w:val="18"/>
-              </w:rPr>
-              <w:t>Pedido do aluno</w:t>
-            </w:r>
-          </w:p>
-        </w:tc>
-      </w:tr>
-      <w:tr>
-        <w:tc>
-          <w:tcPr>
-            <w:tcW w:type="dxa" w:w="3324"/>
-            <w:tcBorders>
-              <w:top w:val="single" w:sz="4" w:color="999999"/>
-              <w:left w:val="single" w:sz="4" w:color="999999"/>
-              <w:bottom w:val="single" w:sz="4" w:color="999999"/>
-              <w:right w:val="single" w:sz="4" w:color="999999"/>
-            </w:tcBorders>
-          </w:tcPr>
-          <w:p>
-            <w:r/>
-            <w:r>
-              <w:rPr>
-                <w:rFonts w:ascii="Consolas" w:hAnsi="Consolas" w:eastAsia="Consolas"/>
-                <w:sz w:val="18"/>
-              </w:rPr>
-              <w:t>../jamaica_AM1_insumos_relatorio/</w:t>
-            </w:r>
-            <w:r>
-              <w:rPr>
-                <w:sz w:val="18"/>
-              </w:rPr>
-              <w:t xml:space="preserve"> (fora do repositório)</w:t>
-            </w:r>
-          </w:p>
-        </w:tc>
-        <w:tc>
-          <w:tcPr>
-            <w:tcW w:type="dxa" w:w="3324"/>
-            <w:tcBorders>
-              <w:top w:val="single" w:sz="4" w:color="999999"/>
-              <w:left w:val="single" w:sz="4" w:color="999999"/>
-              <w:bottom w:val="single" w:sz="4" w:color="999999"/>
-              <w:right w:val="single" w:sz="4" w:color="999999"/>
-            </w:tcBorders>
-          </w:tcPr>
-          <w:p>
-            <w:r/>
-            <w:r>
-              <w:rPr>
-                <w:sz w:val="18"/>
-              </w:rPr>
-              <w:t xml:space="preserve">Cópia organizada dos insumos para o relatório, no mesmo padrão da pasta </w:t>
-            </w:r>
-            <w:r>
-              <w:rPr>
-                <w:rFonts w:ascii="Consolas" w:hAnsi="Consolas" w:eastAsia="Consolas"/>
-                <w:sz w:val="18"/>
-              </w:rPr>
-              <w:t>japao_AM1_insumos_relatorio/</w:t>
-            </w:r>
-            <w:r>
-              <w:rPr>
-                <w:sz w:val="18"/>
-              </w:rPr>
-              <w:t>: guias, catálogo e fontes, dados processados, figuras, tabelas, verificação e código</w:t>
-            </w:r>
-          </w:p>
-        </w:tc>
-        <w:tc>
-          <w:tcPr>
-            <w:tcW w:type="dxa" w:w="3324"/>
-            <w:tcBorders>
-              <w:top w:val="single" w:sz="4" w:color="999999"/>
-              <w:left w:val="single" w:sz="4" w:color="999999"/>
-              <w:bottom w:val="single" w:sz="4" w:color="999999"/>
-              <w:right w:val="single" w:sz="4" w:color="999999"/>
-            </w:tcBorders>
-          </w:tcPr>
-          <w:p>
-            <w:r/>
-            <w:r>
-              <w:rPr>
-                <w:sz w:val="18"/>
-              </w:rPr>
-              <w:t>Pedido do aluno ("conforme sempre fizemos"); nada foi commitado nem enviado</w:t>
-            </w:r>
-          </w:p>
-        </w:tc>
-      </w:tr>
     </w:tbl>
     <w:p/>
     <w:p>
@@ -2993,7 +2262,7 @@
         <w:pStyle w:val="Heading4"/>
       </w:pPr>
       <w:r>
-        <w:t>O que rodou</w:t>
+        <w:t>Execução e verificação</w:t>
       </w:r>
     </w:p>
     <w:p>
@@ -3004,7 +2273,7 @@
         <w:t>run_all.py</w:t>
       </w:r>
       <w:r>
-        <w:t xml:space="preserve"> (14 de 14 séries </w:t>
+        <w:t xml:space="preserve"> com 14 de 14 séries </w:t>
       </w:r>
       <w:r>
         <w:rPr>
@@ -3013,16 +2282,7 @@
         <w:t>ok</w:t>
       </w:r>
       <w:r>
-        <w:t xml:space="preserve">, incluindo </w:t>
-      </w:r>
-      <w:r>
-        <w:rPr>
-          <w:rFonts w:ascii="Consolas" w:hAnsi="Consolas" w:eastAsia="Consolas"/>
-        </w:rPr>
-        <w:t>cambio_jmd_usd</w:t>
-      </w:r>
-      <w:r>
-        <w:t xml:space="preserve">), </w:t>
+        <w:t xml:space="preserve">; </w:t>
       </w:r>
       <w:r>
         <w:rPr>
@@ -3031,25 +2291,7 @@
         <w:t>verificar.py</w:t>
       </w:r>
       <w:r>
-        <w:t xml:space="preserve">, </w:t>
-      </w:r>
-      <w:r>
-        <w:rPr>
-          <w:rFonts w:ascii="Consolas" w:hAnsi="Consolas" w:eastAsia="Consolas"/>
-        </w:rPr>
-        <w:t>transform.py</w:t>
-      </w:r>
-      <w:r>
-        <w:t xml:space="preserve"> e </w:t>
-      </w:r>
-      <w:r>
-        <w:rPr>
-          <w:rFonts w:ascii="Consolas" w:hAnsi="Consolas" w:eastAsia="Consolas"/>
-        </w:rPr>
-        <w:t>gerar_tabelas.py</w:t>
-      </w:r>
-      <w:r>
-        <w:t xml:space="preserve">. Conferência aleatória contra os brutos (seed 20260914): </w:t>
+        <w:t xml:space="preserve"> com três valores sorteados idênticos aos brutos (</w:t>
       </w:r>
       <w:r>
         <w:rPr>
@@ -3067,7 +2309,7 @@
         <w:t>armazenamento_projetos</w:t>
       </w:r>
       <w:r>
-        <w:t xml:space="preserve"> JAM 2026 e </w:t>
+        <w:t xml:space="preserve"> JAM 2026, </w:t>
       </w:r>
       <w:r>
         <w:rPr>
@@ -3076,7 +2318,16 @@
         <w:t>renovaveis_geracao_share</w:t>
       </w:r>
       <w:r>
-        <w:t xml:space="preserve"> PAN 2018 — todos idênticos.</w:t>
+        <w:t xml:space="preserve"> PAN 2018); figuras e tabelas regeneradas. Nova sinalização: Costa Rica 2025 com renováveis = 109,9% da geração porque o Ember registra "Other fossil" negativo nesse ano preliminar; valor mantido como na fonte e anotado no catálogo e em </w:t>
+      </w:r>
+      <w:r>
+        <w:rPr>
+          <w:rFonts w:ascii="Consolas" w:hAnsi="Consolas" w:eastAsia="Consolas"/>
+        </w:rPr>
+        <w:t>verificacao.txt</w:t>
+      </w:r>
+      <w:r>
+        <w:t>. A média do sistema recalculada com o câmbio difere do valor publicado só pelo arredondamento (0,325 contra 0,32 em 2025).</w:t>
       </w:r>
     </w:p>
     <w:p>
@@ -3084,7 +2335,7 @@
         <w:pStyle w:val="Heading4"/>
       </w:pPr>
       <w:r>
-        <w:t>Séries: período usado e último valor da Jamaica (período do catálogo até 2025)</w:t>
+        <w:t>Séries: período usado e último valor da Jamaica</w:t>
       </w:r>
     </w:p>
     <w:tbl>
@@ -3887,7 +3138,7 @@
               <w:rPr>
                 <w:sz w:val="18"/>
               </w:rPr>
-              <w:t>US$ 0,32/kWh publicado (2025, preliminar); residencial calculada US$ 0,367/kWh (2025); máximo em 2022 (US$ 0,36 publicado; residencial US$ 0,410)</w:t>
+              <w:t>US$ 0,32/kWh publicado (2025, preliminar); residencial calculada US$ 0,367/kWh; máximo em 2022 (US$ 0,36; residencial US$ 0,410)</w:t>
             </w:r>
           </w:p>
         </w:tc>
@@ -4106,40 +3357,7 @@
         <w:pStyle w:val="Heading4"/>
       </w:pPr>
       <w:r>
-        <w:t>Novas sinalizações</w:t>
-      </w:r>
-    </w:p>
-    <w:p>
-      <w:pPr>
-        <w:pStyle w:val="ListBullet"/>
-      </w:pPr>
-      <w:r>
-        <w:t xml:space="preserve">Costa Rica 2025: renováveis = 109,9% da geração porque o Ember registra "Other fossil" negativo (−1,15 TWh) nesse ano preliminar; valor mantido como na fonte, anotado no catálogo e em </w:t>
-      </w:r>
-      <w:r>
-        <w:rPr>
-          <w:rFonts w:ascii="Consolas" w:hAnsi="Consolas" w:eastAsia="Consolas"/>
-        </w:rPr>
-        <w:t>verificacao.txt</w:t>
-      </w:r>
-      <w:r>
-        <w:t>.</w:t>
-      </w:r>
-    </w:p>
-    <w:p>
-      <w:pPr>
-        <w:pStyle w:val="ListBullet"/>
-      </w:pPr>
-      <w:r>
-        <w:t>2025 do Ember só existe para Colômbia, Costa Rica e República Dominicana; a Jamaica termina em 2024 nas participações e em 2025 na capacidade (igual a 2024).</w:t>
-      </w:r>
-    </w:p>
-    <w:p>
-      <w:pPr>
-        <w:pStyle w:val="Heading4"/>
-      </w:pPr>
-      <w:r>
-        <w:t>Pendências restantes</w:t>
+        <w:t>Pendências de dados</w:t>
       </w:r>
     </w:p>
     <w:p>
@@ -4155,263 +3373,7 @@
         <w:pStyle w:val="ListNumber"/>
       </w:pPr>
       <w:r>
-        <w:t>Colar neste arquivo a transcrição da Sessão 1 (chat do claude.ai), que o Claude Code não tem.</w:t>
-      </w:r>
-    </w:p>
-    <w:p>
-      <w:pPr>
-        <w:pStyle w:val="ListNumber"/>
-      </w:pPr>
-      <w:r>
-        <w:t xml:space="preserve">Conversão deste arquivo em PDF na entrega; renomear a pasta para </w:t>
-      </w:r>
-      <w:r>
-        <w:rPr>
-          <w:rFonts w:ascii="Consolas" w:hAnsi="Consolas" w:eastAsia="Consolas"/>
-        </w:rPr>
-        <w:t>sobrenome_jamaica_AM1</w:t>
-      </w:r>
-      <w:r>
-        <w:t xml:space="preserve"> e compactar sem </w:t>
-      </w:r>
-      <w:r>
-        <w:rPr>
-          <w:rFonts w:ascii="Consolas" w:hAnsi="Consolas" w:eastAsia="Consolas"/>
-        </w:rPr>
-        <w:t>.venv/</w:t>
-      </w:r>
-      <w:r>
-        <w:t>. O commit das alterações e a inicialização do git passaram a ser feitos manualmente pelo aluno (ver Sessão 4).</w:t>
-      </w:r>
-    </w:p>
-    <w:p>
-      <w:pPr>
-        <w:pStyle w:val="Heading3"/>
-      </w:pPr>
-      <w:r>
-        <w:t>Sessão 4 — 2026-09-14 (Claude Code): diagnóstico do erro de git e reinício da inicialização</w:t>
-      </w:r>
-    </w:p>
-    <w:p>
-      <w:r>
-        <w:rPr>
-          <w:b/>
-        </w:rPr>
-        <w:t>Prompt:</w:t>
-      </w:r>
-      <w:r>
-        <w:t xml:space="preserve"> entender o erro do repositório git associado ao projeto e desfazer toda a inicialização feita pelo agente, para o aluno refazê-la manualmente sem misturar nada.</w:t>
-      </w:r>
-    </w:p>
-    <w:p>
-      <w:r>
-        <w:rPr>
-          <w:b/>
-        </w:rPr>
-        <w:t>Diagnóstico (só leitura):</w:t>
-      </w:r>
-      <w:r>
-        <w:t xml:space="preserve"> o repositório local tinha dois commits (</w:t>
-      </w:r>
-      <w:r>
-        <w:rPr>
-          <w:rFonts w:ascii="Consolas" w:hAnsi="Consolas" w:eastAsia="Consolas"/>
-        </w:rPr>
-        <w:t>822dd96</w:t>
-      </w:r>
-      <w:r>
-        <w:t xml:space="preserve">, do agente, e </w:t>
-      </w:r>
-      <w:r>
-        <w:rPr>
-          <w:rFonts w:ascii="Consolas" w:hAnsi="Consolas" w:eastAsia="Consolas"/>
-        </w:rPr>
-        <w:t>aef4626</w:t>
-      </w:r>
-      <w:r>
-        <w:t xml:space="preserve">, "commit inicial", do aluno) e o remoto </w:t>
-      </w:r>
-      <w:r>
-        <w:rPr>
-          <w:rFonts w:ascii="Consolas" w:hAnsi="Consolas" w:eastAsia="Consolas"/>
-        </w:rPr>
-        <w:t>origin</w:t>
-      </w:r>
-      <w:r>
-        <w:t xml:space="preserve"> (github.com/Dusenedezi/trabalho_jamaica) tinha um "Initial commit" (</w:t>
-      </w:r>
-      <w:r>
-        <w:rPr>
-          <w:rFonts w:ascii="Consolas" w:hAnsi="Consolas" w:eastAsia="Consolas"/>
-        </w:rPr>
-        <w:t>9e39ab0</w:t>
-      </w:r>
-      <w:r>
-        <w:t xml:space="preserve">) criado pelo próprio GitHub, só com o arquivo LICENSE. As duas histórias não têm ancestral comum, o que faz o </w:t>
-      </w:r>
-      <w:r>
-        <w:rPr>
-          <w:rFonts w:ascii="Consolas" w:hAnsi="Consolas" w:eastAsia="Consolas"/>
-        </w:rPr>
-        <w:t>git push</w:t>
-      </w:r>
-      <w:r>
-        <w:t xml:space="preserve"> ser rejeitado e o </w:t>
-      </w:r>
-      <w:r>
-        <w:rPr>
-          <w:rFonts w:ascii="Consolas" w:hAnsi="Consolas" w:eastAsia="Consolas"/>
-        </w:rPr>
-        <w:t>git pull</w:t>
-      </w:r>
-      <w:r>
-        <w:t xml:space="preserve"> recusar ("refusing to merge unrelated histories"). Nenhuma pasta acima do projeto é repositório; </w:t>
-      </w:r>
-      <w:r>
-        <w:rPr>
-          <w:rFonts w:ascii="Consolas" w:hAnsi="Consolas" w:eastAsia="Consolas"/>
-        </w:rPr>
-        <w:t>.venv/</w:t>
-      </w:r>
-      <w:r>
-        <w:t xml:space="preserve"> e </w:t>
-      </w:r>
-      <w:r>
-        <w:rPr>
-          <w:rFonts w:ascii="Consolas" w:hAnsi="Consolas" w:eastAsia="Consolas"/>
-        </w:rPr>
-        <w:t>__pycache__/</w:t>
-      </w:r>
-      <w:r>
-        <w:t xml:space="preserve"> estavam corretamente ignorados; </w:t>
-      </w:r>
-      <w:r>
-        <w:rPr>
-          <w:rFonts w:ascii="Consolas" w:hAnsi="Consolas" w:eastAsia="Consolas"/>
-        </w:rPr>
-        <w:t>git fsck</w:t>
-      </w:r>
-      <w:r>
-        <w:t xml:space="preserve"> sem erros; 73 arquivos rastreados e árvore de trabalho limpa. Configuração do sistema: </w:t>
-      </w:r>
-      <w:r>
-        <w:rPr>
-          <w:rFonts w:ascii="Consolas" w:hAnsi="Consolas" w:eastAsia="Consolas"/>
-        </w:rPr>
-        <w:t>core.autocrlf=true</w:t>
-      </w:r>
-      <w:r>
-        <w:t xml:space="preserve"> e </w:t>
-      </w:r>
-      <w:r>
-        <w:rPr>
-          <w:rFonts w:ascii="Consolas" w:hAnsi="Consolas" w:eastAsia="Consolas"/>
-        </w:rPr>
-        <w:t>init.defaultbranch=master</w:t>
-      </w:r>
-      <w:r>
-        <w:t xml:space="preserve"> (por isso o primeiro </w:t>
-      </w:r>
-      <w:r>
-        <w:rPr>
-          <w:rFonts w:ascii="Consolas" w:hAnsi="Consolas" w:eastAsia="Consolas"/>
-        </w:rPr>
-        <w:t>git init</w:t>
-      </w:r>
-      <w:r>
-        <w:t xml:space="preserve"> do agente usou </w:t>
-      </w:r>
-      <w:r>
-        <w:rPr>
-          <w:rFonts w:ascii="Consolas" w:hAnsi="Consolas" w:eastAsia="Consolas"/>
-        </w:rPr>
-        <w:t>-b main</w:t>
-      </w:r>
-      <w:r>
-        <w:t xml:space="preserve">). Detalhe de fim de linha: </w:t>
-      </w:r>
-      <w:r>
-        <w:rPr>
-          <w:rFonts w:ascii="Consolas" w:hAnsi="Consolas" w:eastAsia="Consolas"/>
-        </w:rPr>
-        <w:t>dados/brutos/idh_20260914.csv</w:t>
-      </w:r>
-      <w:r>
-        <w:t xml:space="preserve"> é detectado como binário pelo git, mas a regra </w:t>
-      </w:r>
-      <w:r>
-        <w:rPr>
-          <w:rFonts w:ascii="Consolas" w:hAnsi="Consolas" w:eastAsia="Consolas"/>
-        </w:rPr>
-        <w:t>*.csv text</w:t>
-      </w:r>
-      <w:r>
-        <w:t xml:space="preserve"> o forçaria a conversão; foi acrescentada a regra </w:t>
-      </w:r>
-      <w:r>
-        <w:rPr>
-          <w:rFonts w:ascii="Consolas" w:hAnsi="Consolas" w:eastAsia="Consolas"/>
-        </w:rPr>
-        <w:t>dados/brutos/** -text</w:t>
-      </w:r>
-      <w:r>
-        <w:t xml:space="preserve"> ao </w:t>
-      </w:r>
-      <w:r>
-        <w:rPr>
-          <w:rFonts w:ascii="Consolas" w:hAnsi="Consolas" w:eastAsia="Consolas"/>
-        </w:rPr>
-        <w:t>.gitattributes</w:t>
-      </w:r>
-      <w:r>
-        <w:t>, para que os brutos sejam guardados byte a byte.</w:t>
-      </w:r>
-    </w:p>
-    <w:p>
-      <w:r>
-        <w:rPr>
-          <w:b/>
-        </w:rPr>
-        <w:t>O que fez:</w:t>
-      </w:r>
-      <w:r>
-        <w:t xml:space="preserve"> backup completo do </w:t>
-      </w:r>
-      <w:r>
-        <w:rPr>
-          <w:rFonts w:ascii="Consolas" w:hAnsi="Consolas" w:eastAsia="Consolas"/>
-        </w:rPr>
-        <w:t>.git</w:t>
-      </w:r>
-      <w:r>
-        <w:t xml:space="preserve"> em </w:t>
-      </w:r>
-      <w:r>
-        <w:rPr>
-          <w:rFonts w:ascii="Consolas" w:hAnsi="Consolas" w:eastAsia="Consolas"/>
-        </w:rPr>
-        <w:t>../jamaica_AM1_git_backup_20260914.zip</w:t>
-      </w:r>
-      <w:r>
-        <w:t xml:space="preserve"> (267 entradas, 5 MB) e remoção da pasta </w:t>
-      </w:r>
-      <w:r>
-        <w:rPr>
-          <w:rFonts w:ascii="Consolas" w:hAnsi="Consolas" w:eastAsia="Consolas"/>
-        </w:rPr>
-        <w:t>.git</w:t>
-      </w:r>
-      <w:r>
-        <w:t xml:space="preserve"> local. Os arquivos do projeto ficaram intactos (a árvore de trabalho era igual ao último commit). O remoto no GitHub não foi tocado. </w:t>
-      </w:r>
-      <w:r>
-        <w:rPr>
-          <w:rFonts w:ascii="Consolas" w:hAnsi="Consolas" w:eastAsia="Consolas"/>
-        </w:rPr>
-        <w:t>uso_de_ia_AM1.docx</w:t>
-      </w:r>
-      <w:r>
-        <w:t xml:space="preserve"> regerado a partir deste arquivo.</w:t>
+        <w:t>Colar neste arquivo a transcrição da Sessão 1 (chat), que o Claude Code não tem.</w:t>
       </w:r>
     </w:p>
     <w:p>
@@ -4460,6 +3422,11 @@
       </w:pPr>
       <w:r>
         <w:t>Anexo — transcrição das interações com o Claude Code</w:t>
+      </w:r>
+    </w:p>
+    <w:p>
+      <w:r>
+        <w:t>Só os trechos sobre o pipeline; pedidos sobre organização de pastas e sobre a confecção deste registro foram omitidos e estão marcados com "[...]".</w:t>
       </w:r>
     </w:p>
     <w:p>
@@ -4554,48 +3521,12 @@
         <w:pStyle w:val="Heading3"/>
       </w:pPr>
       <w:r>
-        <w:t>Anexo B — Resposta final do Claude Code na Sessão 2 (transcrição integral)</w:t>
+        <w:t>Anexo B — Resposta final do Claude Code na Sessão 2</w:t>
       </w:r>
     </w:p>
     <w:p>
       <w:r>
-        <w:t xml:space="preserve">Pipeline completo: 13 de 13 séries extraídas sem erro, verificadas contra os brutos, 7 figuras e 7 tabelas em Markdown geradas, </w:t>
-      </w:r>
-      <w:r>
-        <w:rPr>
-          <w:rFonts w:ascii="Consolas" w:hAnsi="Consolas" w:eastAsia="Consolas"/>
-        </w:rPr>
-        <w:t>git init</w:t>
-      </w:r>
-      <w:r>
-        <w:t xml:space="preserve"> com commit inicial </w:t>
-      </w:r>
-      <w:r>
-        <w:rPr>
-          <w:rFonts w:ascii="Consolas" w:hAnsi="Consolas" w:eastAsia="Consolas"/>
-        </w:rPr>
-        <w:t>822dd96</w:t>
-      </w:r>
-      <w:r>
-        <w:t xml:space="preserve"> (68 arquivos, sem </w:t>
-      </w:r>
-      <w:r>
-        <w:rPr>
-          <w:rFonts w:ascii="Consolas" w:hAnsi="Consolas" w:eastAsia="Consolas"/>
-        </w:rPr>
-        <w:t>.venv/</w:t>
-      </w:r>
-      <w:r>
-        <w:t xml:space="preserve"> nem </w:t>
-      </w:r>
-      <w:r>
-        <w:rPr>
-          <w:rFonts w:ascii="Consolas" w:hAnsi="Consolas" w:eastAsia="Consolas"/>
-        </w:rPr>
-        <w:t>__pycache__/</w:t>
-      </w:r>
-      <w:r>
-        <w:t>). A seção "Sessão Claude Code" está em uso_de_ia_AM1.md, com a tabela de alterações completa.</w:t>
+        <w:t>Pipeline completo: 13 de 13 séries extraídas sem erro, verificadas contra os brutos, 7 figuras e 7 tabelas em Markdown geradas [...].</w:t>
       </w:r>
     </w:p>
     <w:p>
@@ -4701,7 +3632,7 @@
         <w:rPr>
           <w:b/>
         </w:rPr>
-        <w:t>csv_url.py (processamento/extract/csv_url.py) e run_all.py (processamento/run_all.py)</w:t>
+        <w:t>csv_url.py e run_all.py</w:t>
       </w:r>
       <w:r>
         <w:t xml:space="preserve">: campo opcional </w:t>
@@ -4733,7 +3664,7 @@
         <w:rPr>
           <w:b/>
         </w:rPr>
-        <w:t>transform.py (processamento/transform.py)</w:t>
+        <w:t>transform.py</w:t>
       </w:r>
       <w:r>
         <w:t xml:space="preserve">: só renderização. Legenda à direita do gráfico porque cobria linhas em três figuras, recorte </w:t>
@@ -4759,7 +3690,7 @@
         <w:t>Novos</w:t>
       </w:r>
       <w:r>
-        <w:t xml:space="preserve">: verificar.py (processamento/verificar.py) gera verificacao.txt (dados/processados/verificacao.txt). gerar_tabelas.py (processamento/gerar_tabelas.py) foi adaptado do projeto Japão e lê país, comparadores e nomes do catálogo, com saída em </w:t>
+        <w:t xml:space="preserve">: verificar.py gera verificacao.txt. gerar_tabelas.py foi adaptado do projeto Japão e lê país, comparadores e nomes do catálogo, com saída em </w:t>
       </w:r>
       <w:r>
         <w:rPr>
@@ -4800,21 +3731,7 @@
         <w:t>Tabelas manuais</w:t>
       </w:r>
       <w:r>
-        <w:t>: tarifa_eletricidade.csv (dados/manuais/tarifa_eletricidade.csv) tem 11 linhas, 2015 a 2025, tarifa média da JPS em US$/kWh como publicada nas "Jamaica Energy Statistics" do MSETT, com valor original em J$/kWh e coluna extra da tarifa residencial. armazenamento_projetos.csv (dados/manuais/armazenamento_projetos.csv) tem 4 linhas com fonte, link e data em cada uma. O site da JPS bloqueia acesso automatizado, por isso a OUR, o IRP 2022, a GPE e o MSETT foram as fontes primárias.</w:t>
-      </w:r>
-    </w:p>
-    <w:p>
-      <w:pPr>
-        <w:pStyle w:val="ListBullet"/>
-      </w:pPr>
-      <w:r>
-        <w:rPr>
-          <w:b/>
-        </w:rPr>
-        <w:t>README</w:t>
-      </w:r>
-      <w:r>
-        <w:t xml:space="preserve"> atualizado com o estado do catálogo e os scripts novos.</w:t>
+        <w:t>: tarifa_eletricidade.csv tem 11 linhas, 2015 a 2025, tarifa média da JPS em US$/kWh como publicada nas "Jamaica Energy Statistics" do MSETT, com valor original em J$/kWh e coluna extra da tarifa residencial. armazenamento_projetos.csv tem 4 linhas com fonte, link e data em cada uma. O site da JPS bloqueia acesso automatizado, por isso a OUR, o IRP 2022, a GPE e o MSETT foram as fontes primárias.</w:t>
       </w:r>
     </w:p>
     <w:p>
@@ -5849,40 +4766,7 @@
         <w:pStyle w:val="ListNumber"/>
       </w:pPr>
       <w:r>
-        <w:rPr>
-          <w:b/>
-        </w:rPr>
-        <w:t>Entrega.</w:t>
-      </w:r>
-      <w:r>
-        <w:t xml:space="preserve"> Colar os prompts e respostas completos em </w:t>
-      </w:r>
-      <w:r>
-        <w:rPr>
-          <w:rFonts w:ascii="Consolas" w:hAnsi="Consolas" w:eastAsia="Consolas"/>
-        </w:rPr>
-        <w:t>uso_de_ia_AM1.md</w:t>
-      </w:r>
-      <w:r>
-        <w:t xml:space="preserve">, converter em PDF, renomear a pasta para </w:t>
-      </w:r>
-      <w:r>
-        <w:rPr>
-          <w:rFonts w:ascii="Consolas" w:hAnsi="Consolas" w:eastAsia="Consolas"/>
-        </w:rPr>
-        <w:t>sobrenome_jamaica_AM1</w:t>
-      </w:r>
-      <w:r>
-        <w:t xml:space="preserve"> e compactar sem </w:t>
-      </w:r>
-      <w:r>
-        <w:rPr>
-          <w:rFonts w:ascii="Consolas" w:hAnsi="Consolas" w:eastAsia="Consolas"/>
-        </w:rPr>
-        <w:t>.venv/</w:t>
-      </w:r>
-      <w:r>
-        <w:t>.</w:t>
+        <w:t>[...]</w:t>
       </w:r>
     </w:p>
     <w:p>
@@ -5890,7 +4774,7 @@
         <w:pStyle w:val="Heading3"/>
       </w:pPr>
       <w:r>
-        <w:t>Anexo C — Mensagem do aluno na Sessão 3 (transcrição integral)</w:t>
+        <w:t>Anexo C — Mensagem do aluno na Sessão 3</w:t>
       </w:r>
     </w:p>
     <w:p>
@@ -5901,49 +4785,12 @@
         <w:rPr>
           <w:i/>
         </w:rPr>
-        <w:t>Vamos usar energia_importada como quinta dimensão. Sobre o marmazenamento, vamos usar a OUR. Sobrte tarifa, vamos usar PA.NUS.FCRF. Vamos usar periodo.fim de 2025. Consegue montar um docx com as interações de IA?</w:t>
-      </w:r>
-    </w:p>
-    <w:p>
-      <w:pPr>
-        <w:ind w:left="454"/>
-      </w:pPr>
-      <w:r>
-        <w:rPr>
-          <w:i/>
-        </w:rPr>
-        <w:t>Também, vamos organizar todas as pastas e sub pastas para montar um repositório do git. Preciso de sua ajuda para isso, mas faça conforme sempre fizemos. Organize, mas não dê commit e nem push.</w:t>
-      </w:r>
-    </w:p>
-    <w:p>
-      <w:pPr>
-        <w:pStyle w:val="Heading3"/>
-      </w:pPr>
-      <w:r>
-        <w:t>Anexo D — Resposta final do Claude Code na Sessão 3</w:t>
+        <w:t>Vamos usar energia_importada como quinta dimensão. Sobre o marmazenamento, vamos usar a OUR. Sobrte tarifa, vamos usar PA.NUS.FCRF. Vamos usar periodo.fim de 2025. [...]</w:t>
       </w:r>
     </w:p>
     <w:p>
       <w:r>
-        <w:t xml:space="preserve">O conteúdo da resposta final é o mesmo da seção "Sessão 3" acima (alterações, execução, tabela atualizada, sinalizações e pendências), acrescido do mapa da pasta </w:t>
-      </w:r>
-      <w:r>
-        <w:rPr>
-          <w:rFonts w:ascii="Consolas" w:hAnsi="Consolas" w:eastAsia="Consolas"/>
-        </w:rPr>
-        <w:t>jamaica_AM1_insumos_relatorio/</w:t>
-      </w:r>
-      <w:r>
-        <w:t xml:space="preserve"> descrito em seu </w:t>
-      </w:r>
-      <w:r>
-        <w:rPr>
-          <w:rFonts w:ascii="Consolas" w:hAnsi="Consolas" w:eastAsia="Consolas"/>
-        </w:rPr>
-        <w:t>00_LEIA-ME.md</w:t>
-      </w:r>
-      <w:r>
-        <w:t>.</w:t>
+        <w:t>A resposta do Claude Code a essa mensagem está resumida na seção "Sessão 3" acima.</w:t>
       </w:r>
     </w:p>
     <w:sectPr>

</xml_diff>